<commit_message>
Update Research Report — add PDF export
- Update PRT597 Assessment 03 Research_Report.docx (latest revision)
- Add PRT597 Assessment 03 Research_Report.pdf

Co-Authored-By: Claude Sonnet 4.6 <noreply@anthropic.com>
</commit_message>
<xml_diff>
--- a/PRT597 -  Assessment 03 -Research_Report.docx
+++ b/PRT597 -  Assessment 03 -Research_Report.docx
@@ -10442,7 +10442,18 @@
       </w:r>
       <w:proofErr w:type="gramEnd"/>
       <w:r>
-        <w:t>-R1:8b — Zero-Shot ABSA Labelling</w:t>
+        <w:t>-R1:8</w:t>
+      </w:r>
+      <w:proofErr w:type="gramStart"/>
+      <w:r>
+        <w:t xml:space="preserve">b </w:t>
+      </w:r>
+      <w:r>
+        <w:t>:</w:t>
+      </w:r>
+      <w:proofErr w:type="gramEnd"/>
+      <w:r>
+        <w:t xml:space="preserve"> Zero-Shot ABSA Labelling</w:t>
       </w:r>
       <w:bookmarkEnd w:id="32"/>
     </w:p>
@@ -20544,21 +20555,43 @@
     </w:p>
     <w:p>
       <w:pPr>
-        <w:pStyle w:val="Heading2"/>
-      </w:pPr>
-      <w:r>
-        <w:t>C</w:t>
-      </w:r>
-      <w:r>
-        <w:t xml:space="preserve">. </w:t>
-      </w:r>
-      <w:r>
-        <w:t>Code</w:t>
-      </w:r>
+        <w:rPr>
+          <w:rFonts w:ascii="Times New Roman" w:hAnsi="Times New Roman" w:cs="Times New Roman"/>
+        </w:rPr>
+      </w:pPr>
     </w:p>
     <w:p>
       <w:pPr>
         <w:rPr>
+          <w:rFonts w:ascii="Times New Roman" w:hAnsi="Times New Roman" w:cs="Times New Roman"/>
+        </w:rPr>
+      </w:pPr>
+    </w:p>
+    <w:p>
+      <w:pPr>
+        <w:rPr>
+          <w:rFonts w:ascii="Times New Roman" w:hAnsi="Times New Roman" w:cs="Times New Roman"/>
+        </w:rPr>
+      </w:pPr>
+    </w:p>
+    <w:p>
+      <w:pPr>
+        <w:pStyle w:val="Heading2"/>
+      </w:pPr>
+      <w:r>
+        <w:lastRenderedPageBreak/>
+        <w:t>C</w:t>
+      </w:r>
+      <w:r>
+        <w:t xml:space="preserve">. </w:t>
+      </w:r>
+      <w:r>
+        <w:t>Project Links</w:t>
+      </w:r>
+    </w:p>
+    <w:p>
+      <w:pPr>
+        <w:rPr>
           <w:b/>
           <w:bCs/>
         </w:rPr>
@@ -20568,16 +20601,72 @@
           <w:b/>
           <w:bCs/>
         </w:rPr>
-        <w:t xml:space="preserve">Collab Link - </w:t>
-      </w:r>
+        <w:t xml:space="preserve">GitHub Link - </w:t>
+      </w:r>
+      <w:r>
+        <w:rPr>
+          <w:b/>
+          <w:bCs/>
+        </w:rPr>
+        <w:t xml:space="preserve"> </w:t>
+      </w:r>
+      <w:hyperlink r:id="rId45" w:history="1">
+        <w:r>
+          <w:rPr>
+            <w:rStyle w:val="Hyperlink"/>
+          </w:rPr>
+          <w:t>https://github.com/</w:t>
+        </w:r>
+        <w:r>
+          <w:rPr>
+            <w:rStyle w:val="Hyperlink"/>
+          </w:rPr>
+          <w:t>S</w:t>
+        </w:r>
+        <w:r>
+          <w:rPr>
+            <w:rStyle w:val="Hyperlink"/>
+          </w:rPr>
+          <w:t>hashikaMihiranga/NLP-Assessment-03-Amazon-Review-Sentiment-Chatbot.git</w:t>
+        </w:r>
+      </w:hyperlink>
+    </w:p>
+    <w:p>
+      <w:r>
+        <w:rPr>
+          <w:b/>
+          <w:bCs/>
+        </w:rPr>
+        <w:t xml:space="preserve">OneDrive Link (All Project Files)- </w:t>
+      </w:r>
+      <w:hyperlink r:id="rId46" w:history="1">
+        <w:r>
+          <w:rPr>
+            <w:rStyle w:val="Hyperlink"/>
+          </w:rPr>
+          <w:t>https://charlesdarwinuni-my.sharepoint.com/:f:/g/personal/s385832_students_</w:t>
+        </w:r>
+        <w:r>
+          <w:rPr>
+            <w:rStyle w:val="Hyperlink"/>
+          </w:rPr>
+          <w:t>c</w:t>
+        </w:r>
+        <w:r>
+          <w:rPr>
+            <w:rStyle w:val="Hyperlink"/>
+          </w:rPr>
+          <w:t>du_edu_au/IgASLxUdOLVCQrxIhQXC1PJ4Aen4OcC8Q_SV85QnDzZz63o?e=c72rDM</w:t>
+        </w:r>
+      </w:hyperlink>
     </w:p>
     <w:sectPr>
-      <w:headerReference w:type="even" r:id="rId45"/>
-      <w:headerReference w:type="default" r:id="rId46"/>
-      <w:footerReference w:type="even" r:id="rId47"/>
-      <w:footerReference w:type="default" r:id="rId48"/>
-      <w:headerReference w:type="first" r:id="rId49"/>
-      <w:footerReference w:type="first" r:id="rId50"/>
+      <w:headerReference w:type="even" r:id="rId47"/>
+      <w:headerReference w:type="default" r:id="rId48"/>
+      <w:footerReference w:type="even" r:id="rId49"/>
+      <w:footerReference w:type="default" r:id="rId50"/>
+      <w:headerReference w:type="first" r:id="rId51"/>
+      <w:footerReference w:type="first" r:id="rId52"/>
       <w:pgSz w:w="12240" w:h="15840"/>
       <w:pgMar w:top="1440" w:right="1800" w:bottom="1440" w:left="1800" w:header="720" w:footer="720" w:gutter="0"/>
       <w:cols w:space="720"/>
@@ -34066,6 +34155,30 @@
       <w:rFonts w:cs="Times New Roman"/>
       <w:sz w:val="20"/>
       <w:szCs w:val="24"/>
+    </w:rPr>
+  </w:style>
+  <w:style w:type="character" w:styleId="UnresolvedMention">
+    <w:name w:val="Unresolved Mention"/>
+    <w:basedOn w:val="DefaultParagraphFont"/>
+    <w:uiPriority w:val="99"/>
+    <w:semiHidden/>
+    <w:unhideWhenUsed/>
+    <w:rsid w:val="001C182C"/>
+    <w:rPr>
+      <w:color w:val="605E5C"/>
+      <w:shd w:val="clear" w:color="auto" w:fill="E1DFDD"/>
+    </w:rPr>
+  </w:style>
+  <w:style w:type="character" w:styleId="FollowedHyperlink">
+    <w:name w:val="FollowedHyperlink"/>
+    <w:basedOn w:val="DefaultParagraphFont"/>
+    <w:uiPriority w:val="99"/>
+    <w:semiHidden/>
+    <w:unhideWhenUsed/>
+    <w:rsid w:val="00585F47"/>
+    <w:rPr>
+      <w:color w:val="800080" w:themeColor="followedHyperlink"/>
+      <w:u w:val="single"/>
     </w:rPr>
   </w:style>
 </w:styles>

</xml_diff>